<commit_message>
Plan Hamburguesería Smash: regenerados los 4 entregables y la Guía de Equivalencias (matriz con 59 productos ES)
Via: Claude Code
Co-Authored-By: Claude Opus 5.5 <noreply@anthropic.com>
Claude-Session: https://claude.ai/code/session_01XC64Aa7enUEgrbksa2cneQ
</commit_message>
<xml_diff>
--- a/astro-site/public/dl/plan-negocio-hamburgueseria/plan-de-negocio-hamburgueseria.docx
+++ b/astro-site/public/dl/plan-negocio-hamburgueseria/plan-de-negocio-hamburgueseria.docx
@@ -377,7 +377,7 @@
     </w:p>
     <w:p>
       <w:r>
-        <w:t>Un detalle que te ahorra un disgusto es decir bien qué eres. Esto es una hamburguesería smash de servicio rápido, no una de servicio de mesa ni un restaurante de carta larga, y no hace falta prometer «auténtica» ni «gourmet» para venderla: lo que cuenta es la costra, el pan tostado y la plancha limpia. No prometas «sin gluten»: el pan, la freidora y la plancha comparten superficies y utensilios. Y deja fuera de la carta la «dry aged burger»: según Madrid Salud (Inf26008), no se puede elaborar carne picada con carne madurada más de quince días.</w:t>
+        <w:t>Un detalle que te ahorra un disgusto es decir bien qué eres. Esto es una hamburguesería smash de servicio rápido, no una de servicio de mesa ni un restaurante de carta larga, y no hace falta prometer «auténtica» ni «gourmet» para venderla: lo que cuenta es la costra, el pan tostado y la plancha limpia. No prometas «sin gluten»: el pan, la freidora y la plancha comparten superficies y utensilios. Y deja fuera de la carta la «dry aged burger»: el Reglamento (CE) 853/2004 exige picar la carne refrigerada dentro de los 6 días siguientes al sacrificio (15 si es vacuno deshuesado y envasado al vacío), y una carne madurada semanas queda fuera de plazo, como aplica Madrid Salud (Inf26008).</w:t>
       </w:r>
     </w:p>
     <w:p>
@@ -419,7 +419,7 @@
     </w:p>
     <w:p>
       <w:r>
-        <w:t>El hueco es claro. Para «montar una hamburguesería», la SERP de Google (la página de resultados) da páginas de software y de modelos con inversiones sin fuente («en torno a 80.000 €», «60.000-80.000 € para 30-50 m²»), foros y un curso. Nadie cuenta el picado del día del art. 7.2 del RD 1021/2022, que la carne madurada más de 15 días no se puede picar, la acrilamida ni el coste de cada bola por canal.</w:t>
+        <w:t>El hueco es claro. Para «montar una hamburguesería», la SERP de Google (la página de resultados) da páginas de software y de modelos con inversiones sin fuente («en torno a 80.000 €», «60.000-80.000 € para 30-50 m²»), foros y un curso. Nadie cuenta el picado del día del art. 7.2 del RD 1021/2022, el plazo de 6 días desde el sacrificio (15 en vacuno envasado al vacío) que deja fuera la carne madurada, la acrilamida ni el coste de cada bola por canal.</w:t>
       </w:r>
     </w:p>
     <w:p>
@@ -696,7 +696,7 @@
     </w:p>
     <w:p>
       <w:r>
-        <w:t>El RD 1021/2022 se aplica a la restauración (art. 2.2.a): la carne picada va a 2 °C o menos y los preparados de carne, a 4 °C o menos (art. 4.1). La bola sin sal es carne picada (menos de 1 % de sal, Reglamento (CE) 853/2004, anexo I, 1.13) y, salada antes de la plancha, pasa a preparado de carne (1.15): la smash se sala en la plancha. Si picas en el local, el picado puede hacerse con carácter previo según las necesidades del despacho diario, «no pudiendo conservarse de un día para otro» (art. 7.2), y cumples los capítulos II y III de la sección V del anexo III del Reglamento (CE) 853/2004 (art. 7.3). Si la compras picada a una carnicería, ese suministro entre minoristas tiene que ser marginal, localizado y restringido (art. 3). Y nada de «dry aged burger»: Madrid Salud (Inf26008) dejó escrito que no se puede elaborar carne picada con carne madurada más de quince días.</w:t>
+        <w:t>El RD 1021/2022 se aplica a la restauración (art. 2.2.a): la carne picada va a 2 °C o menos y los preparados de carne, a 4 °C o menos (art. 4.1). La bola sin sal es carne picada (menos de 1 % de sal, Reglamento (CE) 853/2004, anexo I, 1.13) y, salada antes de la plancha, pasa a preparado de carne (1.15): la smash se sala en la plancha. Si picas en el local, el picado puede hacerse con carácter previo según las necesidades del despacho diario, «no pudiendo conservarse de un día para otro» (art. 7.2), y cumples los capítulos II y III de la sección V del anexo III del Reglamento (CE) 853/2004 (art. 7.3). Si la compras picada a una carnicería, ese suministro entre minoristas tiene que ser marginal, localizado y restringido (art. 3). Y nada de «dry aged burger»: el Reglamento (CE) 853/2004 (anexo III, sección V, cap. III) exige picar la carne refrigerada dentro de los 6 días siguientes al sacrificio, o 15 si es vacuno deshuesado y envasado al vacío; una carne madurada semanas queda fuera de plazo, y Madrid Salud (Inf26008) lo aplica así.</w:t>
       </w:r>
     </w:p>
     <w:p>
@@ -716,7 +716,7 @@
     </w:p>
     <w:p>
       <w:r>
-        <w:t>En el IVA (Ley 37/1992, art. 91), en sala todo va al 10 % (91.Uno.2.2.º). Para llevar y a domicilio, la comida va al 10 %, pero se excluyen del reducido las bebidas alcohólicas y las refrescantes, zumos y gaseosas con azúcares o edulcorantes añadidos (91.Uno.1.1.º, a y b): la cerveza y los refrescos, también los zero, que salen del local van al 21 %. El batido de leche no es una bebida refrescante y el plan lo lleva al 10 % (confírmalo con tu gestoría), igual que el desglose por componentes del menú que sale del local (compruébalo con ella). El alcohol para llevar, nunca a menores y con los horarios de tu comunidad autónoma. Según la Ley 1/2025 (art. 8), el cliente puede llevarse lo que no consuma sin coste y el local lo avisa de forma visible, mejor en la carta; el envase de plástico de un solo uso para llevar se cobra aparte en el tique (Ley 7/2022, art. 55). Este marco es el español: en México y el resto de Latinoamérica los trámites y la norma de la carne molida, del aceite y de la acrilamida son otros, y la guía de equivalencias adapta los términos.</w:t>
+        <w:t>En el IVA (Ley 37/1992, art. 91), en sala todo va al 10 % (91.Uno.2.2.º). Para llevar y a domicilio, la comida va al 10 %, pero se excluyen del reducido las bebidas alcohólicas y las refrescantes, zumos y gaseosas con azúcares o edulcorantes añadidos (91.Uno.1.1.º, a y b): la cerveza y los refrescos, también los zero, que salen del local van al 21 %. El art. 91 no recoge el batido expresamente: el plan lo lleva al 10 % como bebida de leche, pero confírmalo con tu gestoría, porque con azúcares o edulcorantes añadidos podría considerarse bebida refrescante (21 %). Lo mismo vale para el desglose por componentes del menú que sale del local (compruébalo con ella). El alcohol para llevar, nunca a menores y con los horarios de tu comunidad autónoma. Según la Ley 1/2025 (art. 8), el cliente puede llevarse lo que no consuma sin coste y el local lo avisa de forma visible, mejor en la carta; el envase de plástico de un solo uso para llevar se cobra aparte en el tique (Ley 7/2022, art. 55). Este marco es el español: en México y el resto de Latinoamérica los trámites y la norma de la carne molida, del aceite y de la acrilamida son otros, y la guía de equivalencias adapta los términos.</w:t>
       </w:r>
     </w:p>
     <w:p>
@@ -743,7 +743,7 @@
     </w:p>
     <w:p>
       <w:r>
-        <w:t>Estos son los trece errores de una hamburguesería y cómo evitarlos. El primero es picar hoy para mañana: la carne picada en el local no se guarda de un día para otro (art. 7.2 del RD 1021/2022), así que pica solo lo del día. El segundo es la «dry aged burger»: Madrid Salud (Inf26008) dejó escrito que no se puede elaborar carne picada con carne madurada más de quince días, así que fuera de la carta las bolas de carne madurada. El tercero es dejar en la cámara a 4 °C unas bolas ya saladas creyendo que son carne picada: son un preparado de carne, y la picada va a 2 °C o menos; sala en la plancha. El cuarto es prometer el punto sin sonda ni APPCC, o servir poco hecha una carne cuyo proveedor pide cocinarla: la cocción no tiene temperatura legal, y el punto de control lo fija tu APPCC con sonda.</w:t>
+        <w:t>Estos son los trece errores de una hamburguesería y cómo evitarlos. El primero es picar hoy para mañana: la carne picada en el local no se guarda de un día para otro (art. 7.2 del RD 1021/2022), así que pica solo lo del día. El segundo es la «dry aged burger»: el Reglamento (CE) 853/2004 exige picar dentro de los 6 días siguientes al sacrificio (15 si es vacuno deshuesado y envasado al vacío), una carne madurada semanas queda fuera de plazo y Madrid Salud (Inf26008) lo aplica así, así que fuera de la carta las bolas de carne madurada. El tercero es dejar en la cámara a 4 °C unas bolas ya saladas creyendo que son carne picada: son un preparado de carne, y la picada va a 2 °C o menos; sala en la plancha. El cuarto es prometer el punto sin sonda ni APPCC, o servir poco hecha una carne cuyo proveedor pide cocinarla: la cocción no tiene temperatura legal, y el punto de control lo fija tu APPCC con sonda.</w:t>
       </w:r>
     </w:p>
     <w:p>

</xml_diff>